<commit_message>
docs: format all references into strict Harvard Referencing style (Author-Date, italic titles, hanging indent)
</commit_message>
<xml_diff>
--- a/Final project report (2).docx
+++ b/Final project report (2).docx
@@ -23081,169 +23081,377 @@
       <w:pPr>
         <w:spacing w:line="276" w:lineRule="auto" w:after="120"/>
         <w:ind w:left="720" w:hanging="720"/>
+        <w:jc w:val="both"/>
       </w:pPr>
       <w:r>
         <w:rPr>
           <w:rFonts w:ascii="Times New Roman" w:hAnsi="Times New Roman"/>
           <w:sz w:val="22"/>
         </w:rPr>
-        <w:t>Bass, L., Clements, P. and Kazman, R. (2021) Software Architecture in Practice. 4th edn. Boston: Addison-Wesley Professional.</w:t>
+        <w:t xml:space="preserve">Bass, L., Clements, P. and Kazman, R. (2021) </w:t>
+      </w:r>
+      <w:r>
+        <w:rPr>
+          <w:rFonts w:ascii="Times New Roman" w:hAnsi="Times New Roman"/>
+          <w:i/>
+          <w:sz w:val="22"/>
+        </w:rPr>
+        <w:t>Software Architecture in Practice</w:t>
+      </w:r>
+      <w:r>
+        <w:rPr>
+          <w:rFonts w:ascii="Times New Roman" w:hAnsi="Times New Roman"/>
+          <w:sz w:val="22"/>
+        </w:rPr>
+        <w:t>. 4th edn. Boston: Addison-Wesley Professional.</w:t>
       </w:r>
     </w:p>
     <w:p>
       <w:pPr>
         <w:spacing w:line="276" w:lineRule="auto" w:after="120"/>
         <w:ind w:left="720" w:hanging="720"/>
+        <w:jc w:val="both"/>
       </w:pPr>
       <w:r>
         <w:rPr>
           <w:rFonts w:ascii="Times New Roman" w:hAnsi="Times New Roman"/>
           <w:sz w:val="22"/>
         </w:rPr>
-        <w:t>Beck, K., Beedle, M., van Bennekum, A., Cockburn, A., Cunningham, W., Fowler, M., Grenning, J., Highsmith, J., Hunt, A., Jeffries, R., Kern, J., Marick, B., Martin, R.C., Mellor, S., Schwaber, K., Sutherland, J. and Thomas, D. (2001) Manifesto for Agile Software Development. Available at: https://agilemanifesto.org/ (Accessed: 15 August 2025).</w:t>
+        <w:t xml:space="preserve">Beck, K., Beedle, M., van Bennekum, A., Cockburn, A., Cunningham, W., Fowler, M., Grenning, J., Highsmith, J., Hunt, A., Jeffries, R., Kern, J., Marick, B., Martin, R.C., Mellor, S., Schwaber, K., Sutherland, J. and Thomas, D. (2001) </w:t>
+      </w:r>
+      <w:r>
+        <w:rPr>
+          <w:rFonts w:ascii="Times New Roman" w:hAnsi="Times New Roman"/>
+          <w:i/>
+          <w:sz w:val="22"/>
+        </w:rPr>
+        <w:t>Manifesto for Agile Software Development</w:t>
+      </w:r>
+      <w:r>
+        <w:rPr>
+          <w:rFonts w:ascii="Times New Roman" w:hAnsi="Times New Roman"/>
+          <w:sz w:val="22"/>
+        </w:rPr>
+        <w:t>. Available at: https://agilemanifesto.org/ (Accessed: 15 August 2025).</w:t>
       </w:r>
     </w:p>
     <w:p>
       <w:pPr>
         <w:spacing w:line="276" w:lineRule="auto" w:after="120"/>
         <w:ind w:left="720" w:hanging="720"/>
+        <w:jc w:val="both"/>
       </w:pPr>
       <w:r>
         <w:rPr>
           <w:rFonts w:ascii="Times New Roman" w:hAnsi="Times New Roman"/>
           <w:sz w:val="22"/>
         </w:rPr>
-        <w:t>Connolly, T.M. and Begg, C.E. (2015) Database Systems: A Practical Approach to Design, Implementation, and Management. 6th edn. Boston: Pearson.</w:t>
+        <w:t xml:space="preserve">Connolly, T.M. and Begg, C.E. (2015) </w:t>
+      </w:r>
+      <w:r>
+        <w:rPr>
+          <w:rFonts w:ascii="Times New Roman" w:hAnsi="Times New Roman"/>
+          <w:i/>
+          <w:sz w:val="22"/>
+        </w:rPr>
+        <w:t>Database Systems: A Practical Approach to Design, Implementation, and Management</w:t>
+      </w:r>
+      <w:r>
+        <w:rPr>
+          <w:rFonts w:ascii="Times New Roman" w:hAnsi="Times New Roman"/>
+          <w:sz w:val="22"/>
+        </w:rPr>
+        <w:t>. 6th edn. Boston: Pearson.</w:t>
       </w:r>
     </w:p>
     <w:p>
       <w:pPr>
         <w:spacing w:line="276" w:lineRule="auto" w:after="120"/>
         <w:ind w:left="720" w:hanging="720"/>
+        <w:jc w:val="both"/>
       </w:pPr>
       <w:r>
         <w:rPr>
           <w:rFonts w:ascii="Times New Roman" w:hAnsi="Times New Roman"/>
           <w:sz w:val="22"/>
         </w:rPr>
-        <w:t>Elmasri, R. and Navathe, S.B. (2015) Fundamentals of Database Systems. 7th edn. Hoboken: Pearson.</w:t>
+        <w:t xml:space="preserve">Elmasri, R. and Navathe, S.B. (2015) </w:t>
+      </w:r>
+      <w:r>
+        <w:rPr>
+          <w:rFonts w:ascii="Times New Roman" w:hAnsi="Times New Roman"/>
+          <w:i/>
+          <w:sz w:val="22"/>
+        </w:rPr>
+        <w:t>Fundamentals of Database Systems</w:t>
+      </w:r>
+      <w:r>
+        <w:rPr>
+          <w:rFonts w:ascii="Times New Roman" w:hAnsi="Times New Roman"/>
+          <w:sz w:val="22"/>
+        </w:rPr>
+        <w:t>. 7th edn. Hoboken: Pearson.</w:t>
       </w:r>
     </w:p>
     <w:p>
       <w:pPr>
         <w:spacing w:line="276" w:lineRule="auto" w:after="120"/>
         <w:ind w:left="720" w:hanging="720"/>
+        <w:jc w:val="both"/>
       </w:pPr>
       <w:r>
         <w:rPr>
           <w:rFonts w:ascii="Times New Roman" w:hAnsi="Times New Roman"/>
           <w:sz w:val="22"/>
         </w:rPr>
-        <w:t>Fielding, R.T. (2000) Architectural Styles and the Design of Network-based Software Architectures. Doctoral dissertation. University of California, Irvine.</w:t>
+        <w:t xml:space="preserve">Fielding, R.T. (2000) </w:t>
+      </w:r>
+      <w:r>
+        <w:rPr>
+          <w:rFonts w:ascii="Times New Roman" w:hAnsi="Times New Roman"/>
+          <w:i/>
+          <w:sz w:val="22"/>
+        </w:rPr>
+        <w:t>Architectural Styles and the Design of Network-based Software Architectures</w:t>
+      </w:r>
+      <w:r>
+        <w:rPr>
+          <w:rFonts w:ascii="Times New Roman" w:hAnsi="Times New Roman"/>
+          <w:sz w:val="22"/>
+        </w:rPr>
+        <w:t>. PhD Thesis. University of California, Irvine.</w:t>
       </w:r>
     </w:p>
     <w:p>
       <w:pPr>
         <w:spacing w:line="276" w:lineRule="auto" w:after="120"/>
         <w:ind w:left="720" w:hanging="720"/>
+        <w:jc w:val="both"/>
       </w:pPr>
       <w:r>
         <w:rPr>
           <w:rFonts w:ascii="Times New Roman" w:hAnsi="Times New Roman"/>
           <w:sz w:val="22"/>
         </w:rPr>
-        <w:t>Gamma, E., Helm, R., Johnson, R. and Vlissides, J. (1994) Design Patterns: Elements of Reusable Object-Oriented Software. Reading: Addison-Wesley.</w:t>
+        <w:t xml:space="preserve">Gamma, E., Helm, R., Johnson, R. and Vlissides, J. (1994) </w:t>
+      </w:r>
+      <w:r>
+        <w:rPr>
+          <w:rFonts w:ascii="Times New Roman" w:hAnsi="Times New Roman"/>
+          <w:i/>
+          <w:sz w:val="22"/>
+        </w:rPr>
+        <w:t>Design Patterns: Elements of Reusable Object-Oriented Software</w:t>
+      </w:r>
+      <w:r>
+        <w:rPr>
+          <w:rFonts w:ascii="Times New Roman" w:hAnsi="Times New Roman"/>
+          <w:sz w:val="22"/>
+        </w:rPr>
+        <w:t>. Reading: Addison-Wesley.</w:t>
       </w:r>
     </w:p>
     <w:p>
       <w:pPr>
         <w:spacing w:line="276" w:lineRule="auto" w:after="120"/>
         <w:ind w:left="720" w:hanging="720"/>
+        <w:jc w:val="both"/>
       </w:pPr>
       <w:r>
         <w:rPr>
           <w:rFonts w:ascii="Times New Roman" w:hAnsi="Times New Roman"/>
           <w:sz w:val="22"/>
         </w:rPr>
-        <w:t>MySQL AB (2024) MySQL 8.0 Reference Manual. Oracle Corporation. Available at: https://dev.mysql.com/doc/refman/8.0/en/ (Accessed: 18 August 2025).</w:t>
+        <w:t xml:space="preserve">MySQL AB (2024) </w:t>
+      </w:r>
+      <w:r>
+        <w:rPr>
+          <w:rFonts w:ascii="Times New Roman" w:hAnsi="Times New Roman"/>
+          <w:i/>
+          <w:sz w:val="22"/>
+        </w:rPr>
+        <w:t>MySQL 8.0 Reference Manual</w:t>
+      </w:r>
+      <w:r>
+        <w:rPr>
+          <w:rFonts w:ascii="Times New Roman" w:hAnsi="Times New Roman"/>
+          <w:sz w:val="22"/>
+        </w:rPr>
+        <w:t>. Oracle Corporation. Available at: https://dev.mysql.com/doc/refman/8.0/en/ (Accessed: 18 August 2025).</w:t>
       </w:r>
     </w:p>
     <w:p>
       <w:pPr>
         <w:spacing w:line="276" w:lineRule="auto" w:after="120"/>
         <w:ind w:left="720" w:hanging="720"/>
+        <w:jc w:val="both"/>
       </w:pPr>
       <w:r>
         <w:rPr>
           <w:rFonts w:ascii="Times New Roman" w:hAnsi="Times New Roman"/>
           <w:sz w:val="22"/>
         </w:rPr>
-        <w:t>Node.js Foundation (2024) Node.js v20 LTS Documentation. OpenJS Foundation. Available at: https://nodejs.org/docs/latest-v20.x/api/ (Accessed: 16 August 2025).</w:t>
+        <w:t xml:space="preserve">Node.js Foundation (2024) </w:t>
+      </w:r>
+      <w:r>
+        <w:rPr>
+          <w:rFonts w:ascii="Times New Roman" w:hAnsi="Times New Roman"/>
+          <w:i/>
+          <w:sz w:val="22"/>
+        </w:rPr>
+        <w:t>Node.js v20 LTS Documentation</w:t>
+      </w:r>
+      <w:r>
+        <w:rPr>
+          <w:rFonts w:ascii="Times New Roman" w:hAnsi="Times New Roman"/>
+          <w:sz w:val="22"/>
+        </w:rPr>
+        <w:t>. OpenJS Foundation. Available at: https://nodejs.org/docs/latest-v20.x/api/ (Accessed: 16 August 2025).</w:t>
       </w:r>
     </w:p>
     <w:p>
       <w:pPr>
         <w:spacing w:line="276" w:lineRule="auto" w:after="120"/>
         <w:ind w:left="720" w:hanging="720"/>
+        <w:jc w:val="both"/>
       </w:pPr>
       <w:r>
         <w:rPr>
           <w:rFonts w:ascii="Times New Roman" w:hAnsi="Times New Roman"/>
           <w:sz w:val="22"/>
         </w:rPr>
-        <w:t>Pressman, R.S. and Maxim, B.R. (2020) Software Engineering: A Practitioner's Approach. 9th edn. New York: McGraw-Hill Education.</w:t>
+        <w:t xml:space="preserve">Pressman, R.S. and Maxim, B.R. (2020) </w:t>
+      </w:r>
+      <w:r>
+        <w:rPr>
+          <w:rFonts w:ascii="Times New Roman" w:hAnsi="Times New Roman"/>
+          <w:i/>
+          <w:sz w:val="22"/>
+        </w:rPr>
+        <w:t>Software Engineering: A Practitioner's Approach</w:t>
+      </w:r>
+      <w:r>
+        <w:rPr>
+          <w:rFonts w:ascii="Times New Roman" w:hAnsi="Times New Roman"/>
+          <w:sz w:val="22"/>
+        </w:rPr>
+        <w:t>. 9th edn. New York: McGraw-Hill Education.</w:t>
       </w:r>
     </w:p>
     <w:p>
       <w:pPr>
         <w:spacing w:line="276" w:lineRule="auto" w:after="120"/>
         <w:ind w:left="720" w:hanging="720"/>
+        <w:jc w:val="both"/>
       </w:pPr>
       <w:r>
         <w:rPr>
           <w:rFonts w:ascii="Times New Roman" w:hAnsi="Times New Roman"/>
           <w:sz w:val="22"/>
         </w:rPr>
-        <w:t>React Documentation (2024) React: The library for web and native user interfaces. Meta Open Source. Available at: https://react.dev/ (Accessed: 12 August 2025).</w:t>
+        <w:t xml:space="preserve">React Documentation (2024) </w:t>
+      </w:r>
+      <w:r>
+        <w:rPr>
+          <w:rFonts w:ascii="Times New Roman" w:hAnsi="Times New Roman"/>
+          <w:i/>
+          <w:sz w:val="22"/>
+        </w:rPr>
+        <w:t>React: The library for web and native user interfaces</w:t>
+      </w:r>
+      <w:r>
+        <w:rPr>
+          <w:rFonts w:ascii="Times New Roman" w:hAnsi="Times New Roman"/>
+          <w:sz w:val="22"/>
+        </w:rPr>
+        <w:t>. Meta Open Source. Available at: https://react.dev/ (Accessed: 12 August 2025).</w:t>
       </w:r>
     </w:p>
     <w:p>
       <w:pPr>
         <w:spacing w:line="276" w:lineRule="auto" w:after="120"/>
         <w:ind w:left="720" w:hanging="720"/>
+        <w:jc w:val="both"/>
       </w:pPr>
       <w:r>
         <w:rPr>
           <w:rFonts w:ascii="Times New Roman" w:hAnsi="Times New Roman"/>
           <w:sz w:val="22"/>
         </w:rPr>
-        <w:t>Rotary International (2023) Rotaract Handbook: A Guide for Clubs and Sponsors. Evanston: Rotary International Publishing.</w:t>
+        <w:t xml:space="preserve">Rotary International (2023) </w:t>
+      </w:r>
+      <w:r>
+        <w:rPr>
+          <w:rFonts w:ascii="Times New Roman" w:hAnsi="Times New Roman"/>
+          <w:i/>
+          <w:sz w:val="22"/>
+        </w:rPr>
+        <w:t>Rotaract Handbook: A Guide for Clubs and Sponsors</w:t>
+      </w:r>
+      <w:r>
+        <w:rPr>
+          <w:rFonts w:ascii="Times New Roman" w:hAnsi="Times New Roman"/>
+          <w:sz w:val="22"/>
+        </w:rPr>
+        <w:t>. Evanston: Rotary International Publishing.</w:t>
       </w:r>
     </w:p>
     <w:p>
       <w:pPr>
         <w:spacing w:line="276" w:lineRule="auto" w:after="120"/>
         <w:ind w:left="720" w:hanging="720"/>
+        <w:jc w:val="both"/>
       </w:pPr>
       <w:r>
         <w:rPr>
           <w:rFonts w:ascii="Times New Roman" w:hAnsi="Times New Roman"/>
           <w:sz w:val="22"/>
         </w:rPr>
-        <w:t>Sommerville, I. (2016) Software Engineering. 10th edn. Harlow: Pearson Education Limited.</w:t>
+        <w:t xml:space="preserve">Sommerville, I. (2016) </w:t>
+      </w:r>
+      <w:r>
+        <w:rPr>
+          <w:rFonts w:ascii="Times New Roman" w:hAnsi="Times New Roman"/>
+          <w:i/>
+          <w:sz w:val="22"/>
+        </w:rPr>
+        <w:t>Software Engineering</w:t>
+      </w:r>
+      <w:r>
+        <w:rPr>
+          <w:rFonts w:ascii="Times New Roman" w:hAnsi="Times New Roman"/>
+          <w:sz w:val="22"/>
+        </w:rPr>
+        <w:t>. 10th edn. Harlow: Pearson Education Limited.</w:t>
       </w:r>
     </w:p>
     <w:p>
       <w:pPr>
         <w:spacing w:line="276" w:lineRule="auto" w:after="120"/>
         <w:ind w:left="720" w:hanging="720"/>
+        <w:jc w:val="both"/>
       </w:pPr>
       <w:r>
         <w:rPr>
           <w:rFonts w:ascii="Times New Roman" w:hAnsi="Times New Roman"/>
           <w:sz w:val="22"/>
         </w:rPr>
-        <w:t>Tailwind Labs Inc. (2024) Tailwind CSS Documentation: A utility-first CSS framework. Available at: https://tailwindcss.com/docs (Accessed: 14 August 2025).</w:t>
+        <w:t xml:space="preserve">Tailwind Labs Inc. (2024) </w:t>
+      </w:r>
+      <w:r>
+        <w:rPr>
+          <w:rFonts w:ascii="Times New Roman" w:hAnsi="Times New Roman"/>
+          <w:i/>
+          <w:sz w:val="22"/>
+        </w:rPr>
+        <w:t>Tailwind CSS Documentation: A utility-first CSS framework</w:t>
+      </w:r>
+      <w:r>
+        <w:rPr>
+          <w:rFonts w:ascii="Times New Roman" w:hAnsi="Times New Roman"/>
+          <w:sz w:val="22"/>
+        </w:rPr>
+        <w:t>. Available at: https://tailwindcss.com/docs (Accessed: 14 August 2025).</w:t>
       </w:r>
     </w:p>
     <w:p>

</xml_diff>